<commit_message>
Simplificar modelo: fecha automática, solo Tienda+Precio por competidor, una foto por producto
Co-Authored-By: Claude Sonnet 5 <noreply@anthropic.com>
</commit_message>
<xml_diff>
--- a/Guia_Capacitacion_Pricing_BestPrice.docx
+++ b/Guia_Capacitacion_Pricing_BestPrice.docx
@@ -11,7 +11,7 @@
         <w:rPr>
           <w:b/>
           <w:bCs/>
-          <w:color w:val="2E7D32"/>
+          <w:color w:val="C2185B"/>
           <w:sz w:val="40"/>
           <w:szCs w:val="40"/>
         </w:rPr>
@@ -29,7 +29,7 @@
           <w:sz w:val="26"/>
           <w:szCs w:val="26"/>
         </w:rPr>
-        <w:t xml:space="preserve">Guía de actualización de la comparativa de precios (HTML + QR)</w:t>
+        <w:t xml:space="preserve">Guía de uso del panel de Pricing (carga de Excel y fotos)</w:t>
       </w:r>
     </w:p>
     <w:p>
@@ -81,7 +81,7 @@
         <w:spacing w:after="120"/>
       </w:pPr>
       <w:r>
-        <w:t xml:space="preserve">Lo que cambia semana a semana no es el QR ni la página, sino la información que esa página muestra: el precio Holi frente a la competencia y la fecha en que se hizo el Scrapp. Esa información se actualiza desde un archivo de datos independiente.</w:t>
+        <w:t xml:space="preserve">Lo que cambia semana a semana no es el QR ni la página, sino la información que esa página muestra: el precio Holi frente a la competencia. Esa información se actualiza desde un panel web sencillo, sin necesidad de tocar código ni pedirle nada a TI cada semana.</w:t>
       </w:r>
     </w:p>
     <w:p>
@@ -94,7 +94,43 @@
           <w:bCs/>
           <w:color w:val="FF8300"/>
         </w:rPr>
-        <w:t xml:space="preserve">Punto clave: el QR NO se vuelve a imprimir cada semana. Solo se actualiza el archivo de datos que alimenta la página.</w:t>
+        <w:t xml:space="preserve">Punto clave: el QR NO se vuelve a imprimir cada semana. Solo se actualiza la información en el panel.</w:t>
+      </w:r>
+    </w:p>
+    <w:p>
+      <w:pPr>
+        <w:pStyle w:val="Heading1"/>
+      </w:pPr>
+      <w:r>
+        <w:t xml:space="preserve">Acceso al panel</w:t>
+      </w:r>
+    </w:p>
+    <w:p>
+      <w:pPr>
+        <w:spacing w:after="120"/>
+      </w:pPr>
+      <w:r>
+        <w:t xml:space="preserve">Entra a la URL del panel (te la proporciona TI) y agrega /admin al final, por ejemplo:</w:t>
+      </w:r>
+    </w:p>
+    <w:p>
+      <w:pPr>
+        <w:spacing w:after="120"/>
+      </w:pPr>
+      <w:r>
+        <w:rPr>
+          <w:i/>
+          <w:iCs/>
+        </w:rPr>
+        <w:t xml:space="preserve">https://[url-del-proyecto].up.railway.app/admin</w:t>
+      </w:r>
+    </w:p>
+    <w:p>
+      <w:pPr>
+        <w:spacing w:after="120"/>
+      </w:pPr>
+      <w:r>
+        <w:t xml:space="preserve">Ingresa con la clave compartida que te dio TI. Todo el equipo de Pricing usa la misma clave.</w:t>
       </w:r>
     </w:p>
     <w:p>
@@ -141,7 +177,7 @@
         <w:spacing w:after="80"/>
       </w:pPr>
       <w:r>
-        <w:t xml:space="preserve">Pricing abre el archivo plantilla_comparativa.xlsx (carpeta “data” del proyecto) y completa una fila por cada producto del programa Best Price, con las columnas indicadas más abajo (los competidores, sus fechas y las imágenes son opcionales y se pueden dejar en blanco).</w:t>
+        <w:t xml:space="preserve">Pricing abre su archivo Excel de comparativa y actualiza una fila por cada producto del programa Best Price, con las columnas indicadas más abajo (los competidores son opcionales y se pueden dejar en blanco).</w:t>
       </w:r>
     </w:p>
     <w:p>
@@ -154,7 +190,7 @@
         <w:spacing w:after="80"/>
       </w:pPr>
       <w:r>
-        <w:t xml:space="preserve">Guardar el archivo con el mismo nombre, sin cambiar los encabezados de columna.</w:t>
+        <w:t xml:space="preserve">En el panel ("1. Cargar Excel con la comparativa"), selecciona ese archivo y haz clic en "Subir Excel". Los precios se actualizan al instante — no hace falta avisar a TI.</w:t>
       </w:r>
     </w:p>
     <w:p>
@@ -167,7 +203,7 @@
         <w:spacing w:after="80"/>
       </w:pPr>
       <w:r>
-        <w:t xml:space="preserve">Ejecutar el script de conversión (o pedir a TI que lo ejecute la primera vez): python3 generar_datos.py — esto genera automáticamente data/data.json con la información nueva.</w:t>
+        <w:t xml:space="preserve">Si algún producto no tiene foto todavía, súbela en la sección "3. Foto de cada producto" (una sola foto por producto, no una por competidor).</w:t>
       </w:r>
     </w:p>
     <w:p>
@@ -180,20 +216,7 @@
         <w:spacing w:after="80"/>
       </w:pPr>
       <w:r>
-        <w:t xml:space="preserve">Publicar/subir el archivo data.json actualizado a la ubicación web definida por TI (el hosting final está pendiente de definir; por ahora, coordinarlo directamente con TI).</w:t>
-      </w:r>
-    </w:p>
-    <w:p>
-      <w:pPr>
-        <w:pStyle w:val="ListParagraph"/>
-        <w:numPr>
-          <w:ilvl w:val="0"/>
-          <w:numId w:val="2"/>
-        </w:numPr>
-        <w:spacing w:after="80"/>
-      </w:pPr>
-      <w:r>
-        <w:t xml:space="preserve">Verificar abriendo comparativa.html?sku=&lt;un SKU de prueba&gt; en el navegador, para confirmar que los precios y la fecha se actualizaron correctamente antes de avisar a tienda.</w:t>
+        <w:t xml:space="preserve">Verifica el resultado: en la sección "Vista previa" del panel, haz clic en "Ver [nombre del producto]" para confirmar que los precios se ven bien antes de avisar a tienda.</w:t>
       </w:r>
     </w:p>
     <w:p>
@@ -217,22 +240,22 @@
         </w:tblBorders>
       </w:tblPr>
       <w:tblGrid>
-        <w:gridCol w:w="1600"/>
-        <w:gridCol w:w="2600"/>
-        <w:gridCol w:w="2200"/>
-        <w:gridCol w:w="2960"/>
+        <w:gridCol w:w="1900"/>
+        <w:gridCol w:w="3200"/>
+        <w:gridCol w:w="2000"/>
+        <w:gridCol w:w="2260"/>
       </w:tblGrid>
       <w:tr>
         <w:tc>
           <w:tcPr>
-            <w:tcW w:type="dxa" w:w="1600"/>
-            <w:tcBorders>
-              <w:top w:val="single" w:color="CCCCCC" w:sz="2"/>
-              <w:left w:val="single" w:color="CCCCCC" w:sz="2"/>
-              <w:bottom w:val="single" w:color="CCCCCC" w:sz="2"/>
-              <w:right w:val="single" w:color="CCCCCC" w:sz="2"/>
-            </w:tcBorders>
-            <w:shd w:fill="2E7D32" w:val="clear"/>
+            <w:tcW w:type="dxa" w:w="1900"/>
+            <w:tcBorders>
+              <w:top w:val="single" w:color="CCCCCC" w:sz="2"/>
+              <w:left w:val="single" w:color="CCCCCC" w:sz="2"/>
+              <w:bottom w:val="single" w:color="CCCCCC" w:sz="2"/>
+              <w:right w:val="single" w:color="CCCCCC" w:sz="2"/>
+            </w:tcBorders>
+            <w:shd w:fill="C2185B" w:val="clear"/>
             <w:tcMar>
               <w:top w:type="dxa" w:w="60"/>
               <w:left w:type="dxa" w:w="100"/>
@@ -255,14 +278,14 @@
         </w:tc>
         <w:tc>
           <w:tcPr>
-            <w:tcW w:type="dxa" w:w="2600"/>
-            <w:tcBorders>
-              <w:top w:val="single" w:color="CCCCCC" w:sz="2"/>
-              <w:left w:val="single" w:color="CCCCCC" w:sz="2"/>
-              <w:bottom w:val="single" w:color="CCCCCC" w:sz="2"/>
-              <w:right w:val="single" w:color="CCCCCC" w:sz="2"/>
-            </w:tcBorders>
-            <w:shd w:fill="2E7D32" w:val="clear"/>
+            <w:tcW w:type="dxa" w:w="3200"/>
+            <w:tcBorders>
+              <w:top w:val="single" w:color="CCCCCC" w:sz="2"/>
+              <w:left w:val="single" w:color="CCCCCC" w:sz="2"/>
+              <w:bottom w:val="single" w:color="CCCCCC" w:sz="2"/>
+              <w:right w:val="single" w:color="CCCCCC" w:sz="2"/>
+            </w:tcBorders>
+            <w:shd w:fill="C2185B" w:val="clear"/>
             <w:tcMar>
               <w:top w:type="dxa" w:w="60"/>
               <w:left w:type="dxa" w:w="100"/>
@@ -285,14 +308,14 @@
         </w:tc>
         <w:tc>
           <w:tcPr>
-            <w:tcW w:type="dxa" w:w="2200"/>
-            <w:tcBorders>
-              <w:top w:val="single" w:color="CCCCCC" w:sz="2"/>
-              <w:left w:val="single" w:color="CCCCCC" w:sz="2"/>
-              <w:bottom w:val="single" w:color="CCCCCC" w:sz="2"/>
-              <w:right w:val="single" w:color="CCCCCC" w:sz="2"/>
-            </w:tcBorders>
-            <w:shd w:fill="2E7D32" w:val="clear"/>
+            <w:tcW w:type="dxa" w:w="2000"/>
+            <w:tcBorders>
+              <w:top w:val="single" w:color="CCCCCC" w:sz="2"/>
+              <w:left w:val="single" w:color="CCCCCC" w:sz="2"/>
+              <w:bottom w:val="single" w:color="CCCCCC" w:sz="2"/>
+              <w:right w:val="single" w:color="CCCCCC" w:sz="2"/>
+            </w:tcBorders>
+            <w:shd w:fill="C2185B" w:val="clear"/>
             <w:tcMar>
               <w:top w:type="dxa" w:w="60"/>
               <w:left w:type="dxa" w:w="100"/>
@@ -315,14 +338,14 @@
         </w:tc>
         <w:tc>
           <w:tcPr>
-            <w:tcW w:type="dxa" w:w="2960"/>
-            <w:tcBorders>
-              <w:top w:val="single" w:color="CCCCCC" w:sz="2"/>
-              <w:left w:val="single" w:color="CCCCCC" w:sz="2"/>
-              <w:bottom w:val="single" w:color="CCCCCC" w:sz="2"/>
-              <w:right w:val="single" w:color="CCCCCC" w:sz="2"/>
-            </w:tcBorders>
-            <w:shd w:fill="2E7D32" w:val="clear"/>
+            <w:tcW w:type="dxa" w:w="2260"/>
+            <w:tcBorders>
+              <w:top w:val="single" w:color="CCCCCC" w:sz="2"/>
+              <w:left w:val="single" w:color="CCCCCC" w:sz="2"/>
+              <w:bottom w:val="single" w:color="CCCCCC" w:sz="2"/>
+              <w:right w:val="single" w:color="CCCCCC" w:sz="2"/>
+            </w:tcBorders>
+            <w:shd w:fill="C2185B" w:val="clear"/>
             <w:tcMar>
               <w:top w:type="dxa" w:w="60"/>
               <w:left w:type="dxa" w:w="100"/>
@@ -347,7 +370,7 @@
       <w:tr>
         <w:tc>
           <w:tcPr>
-            <w:tcW w:type="dxa" w:w="1600"/>
+            <w:tcW w:type="dxa" w:w="1900"/>
             <w:tcBorders>
               <w:top w:val="single" w:color="CCCCCC" w:sz="2"/>
               <w:left w:val="single" w:color="CCCCCC" w:sz="2"/>
@@ -373,7 +396,7 @@
         </w:tc>
         <w:tc>
           <w:tcPr>
-            <w:tcW w:type="dxa" w:w="2600"/>
+            <w:tcW w:type="dxa" w:w="3200"/>
             <w:tcBorders>
               <w:top w:val="single" w:color="CCCCCC" w:sz="2"/>
               <w:left w:val="single" w:color="CCCCCC" w:sz="2"/>
@@ -399,7 +422,7 @@
         </w:tc>
         <w:tc>
           <w:tcPr>
-            <w:tcW w:type="dxa" w:w="2200"/>
+            <w:tcW w:type="dxa" w:w="2000"/>
             <w:tcBorders>
               <w:top w:val="single" w:color="CCCCCC" w:sz="2"/>
               <w:left w:val="single" w:color="CCCCCC" w:sz="2"/>
@@ -425,7 +448,7 @@
         </w:tc>
         <w:tc>
           <w:tcPr>
-            <w:tcW w:type="dxa" w:w="2960"/>
+            <w:tcW w:type="dxa" w:w="2260"/>
             <w:tcBorders>
               <w:top w:val="single" w:color="CCCCCC" w:sz="2"/>
               <w:left w:val="single" w:color="CCCCCC" w:sz="2"/>
@@ -453,7 +476,7 @@
       <w:tr>
         <w:tc>
           <w:tcPr>
-            <w:tcW w:type="dxa" w:w="1600"/>
+            <w:tcW w:type="dxa" w:w="1900"/>
             <w:tcBorders>
               <w:top w:val="single" w:color="CCCCCC" w:sz="2"/>
               <w:left w:val="single" w:color="CCCCCC" w:sz="2"/>
@@ -479,7 +502,7 @@
         </w:tc>
         <w:tc>
           <w:tcPr>
-            <w:tcW w:type="dxa" w:w="2600"/>
+            <w:tcW w:type="dxa" w:w="3200"/>
             <w:tcBorders>
               <w:top w:val="single" w:color="CCCCCC" w:sz="2"/>
               <w:left w:val="single" w:color="CCCCCC" w:sz="2"/>
@@ -505,7 +528,7 @@
         </w:tc>
         <w:tc>
           <w:tcPr>
-            <w:tcW w:type="dxa" w:w="2200"/>
+            <w:tcW w:type="dxa" w:w="2000"/>
             <w:tcBorders>
               <w:top w:val="single" w:color="CCCCCC" w:sz="2"/>
               <w:left w:val="single" w:color="CCCCCC" w:sz="2"/>
@@ -531,7 +554,7 @@
         </w:tc>
         <w:tc>
           <w:tcPr>
-            <w:tcW w:type="dxa" w:w="2960"/>
+            <w:tcW w:type="dxa" w:w="2260"/>
             <w:tcBorders>
               <w:top w:val="single" w:color="CCCCCC" w:sz="2"/>
               <w:left w:val="single" w:color="CCCCCC" w:sz="2"/>
@@ -559,7 +582,7 @@
       <w:tr>
         <w:tc>
           <w:tcPr>
-            <w:tcW w:type="dxa" w:w="1600"/>
+            <w:tcW w:type="dxa" w:w="1900"/>
             <w:tcBorders>
               <w:top w:val="single" w:color="CCCCCC" w:sz="2"/>
               <w:left w:val="single" w:color="CCCCCC" w:sz="2"/>
@@ -585,7 +608,7 @@
         </w:tc>
         <w:tc>
           <w:tcPr>
-            <w:tcW w:type="dxa" w:w="2600"/>
+            <w:tcW w:type="dxa" w:w="3200"/>
             <w:tcBorders>
               <w:top w:val="single" w:color="CCCCCC" w:sz="2"/>
               <w:left w:val="single" w:color="CCCCCC" w:sz="2"/>
@@ -611,7 +634,7 @@
         </w:tc>
         <w:tc>
           <w:tcPr>
-            <w:tcW w:type="dxa" w:w="2200"/>
+            <w:tcW w:type="dxa" w:w="2000"/>
             <w:tcBorders>
               <w:top w:val="single" w:color="CCCCCC" w:sz="2"/>
               <w:left w:val="single" w:color="CCCCCC" w:sz="2"/>
@@ -637,7 +660,7 @@
         </w:tc>
         <w:tc>
           <w:tcPr>
-            <w:tcW w:type="dxa" w:w="2960"/>
+            <w:tcW w:type="dxa" w:w="2260"/>
             <w:tcBorders>
               <w:top w:val="single" w:color="CCCCCC" w:sz="2"/>
               <w:left w:val="single" w:color="CCCCCC" w:sz="2"/>
@@ -665,7 +688,7 @@
       <w:tr>
         <w:tc>
           <w:tcPr>
-            <w:tcW w:type="dxa" w:w="1600"/>
+            <w:tcW w:type="dxa" w:w="1900"/>
             <w:tcBorders>
               <w:top w:val="single" w:color="CCCCCC" w:sz="2"/>
               <w:left w:val="single" w:color="CCCCCC" w:sz="2"/>
@@ -691,7 +714,7 @@
         </w:tc>
         <w:tc>
           <w:tcPr>
-            <w:tcW w:type="dxa" w:w="2600"/>
+            <w:tcW w:type="dxa" w:w="3200"/>
             <w:tcBorders>
               <w:top w:val="single" w:color="CCCCCC" w:sz="2"/>
               <w:left w:val="single" w:color="CCCCCC" w:sz="2"/>
@@ -717,7 +740,7 @@
         </w:tc>
         <w:tc>
           <w:tcPr>
-            <w:tcW w:type="dxa" w:w="2200"/>
+            <w:tcW w:type="dxa" w:w="2000"/>
             <w:tcBorders>
               <w:top w:val="single" w:color="CCCCCC" w:sz="2"/>
               <w:left w:val="single" w:color="CCCCCC" w:sz="2"/>
@@ -743,7 +766,7 @@
         </w:tc>
         <w:tc>
           <w:tcPr>
-            <w:tcW w:type="dxa" w:w="2960"/>
+            <w:tcW w:type="dxa" w:w="2260"/>
             <w:tcBorders>
               <w:top w:val="single" w:color="CCCCCC" w:sz="2"/>
               <w:left w:val="single" w:color="CCCCCC" w:sz="2"/>
@@ -771,59 +794,59 @@
       <w:tr>
         <w:tc>
           <w:tcPr>
-            <w:tcW w:type="dxa" w:w="1600"/>
-            <w:tcBorders>
-              <w:top w:val="single" w:color="CCCCCC" w:sz="2"/>
-              <w:left w:val="single" w:color="CCCCCC" w:sz="2"/>
-              <w:bottom w:val="single" w:color="CCCCCC" w:sz="2"/>
-              <w:right w:val="single" w:color="CCCCCC" w:sz="2"/>
-            </w:tcBorders>
-            <w:tcMar>
-              <w:top w:type="dxa" w:w="60"/>
-              <w:left w:type="dxa" w:w="100"/>
-              <w:bottom w:type="dxa" w:w="60"/>
-              <w:right w:type="dxa" w:w="100"/>
-            </w:tcMar>
-          </w:tcPr>
-          <w:p>
-            <w:r>
-              <w:rPr>
-                <w:sz w:val="18"/>
-                <w:szCs w:val="18"/>
-              </w:rPr>
-              <w:t xml:space="preserve">Imagen Producto</w:t>
-            </w:r>
-          </w:p>
-        </w:tc>
-        <w:tc>
-          <w:tcPr>
-            <w:tcW w:type="dxa" w:w="2600"/>
-            <w:tcBorders>
-              <w:top w:val="single" w:color="CCCCCC" w:sz="2"/>
-              <w:left w:val="single" w:color="CCCCCC" w:sz="2"/>
-              <w:bottom w:val="single" w:color="CCCCCC" w:sz="2"/>
-              <w:right w:val="single" w:color="CCCCCC" w:sz="2"/>
-            </w:tcBorders>
-            <w:tcMar>
-              <w:top w:type="dxa" w:w="60"/>
-              <w:left w:type="dxa" w:w="100"/>
-              <w:bottom w:type="dxa" w:w="60"/>
-              <w:right w:type="dxa" w:w="100"/>
-            </w:tcMar>
-          </w:tcPr>
-          <w:p>
-            <w:r>
-              <w:rPr>
-                <w:sz w:val="18"/>
-                <w:szCs w:val="18"/>
-              </w:rPr>
-              <w:t xml:space="preserve">URL de la foto del producto. En blanco, la página muestra un ícono genérico.</w:t>
-            </w:r>
-          </w:p>
-        </w:tc>
-        <w:tc>
-          <w:tcPr>
-            <w:tcW w:type="dxa" w:w="2200"/>
+            <w:tcW w:type="dxa" w:w="1900"/>
+            <w:tcBorders>
+              <w:top w:val="single" w:color="CCCCCC" w:sz="2"/>
+              <w:left w:val="single" w:color="CCCCCC" w:sz="2"/>
+              <w:bottom w:val="single" w:color="CCCCCC" w:sz="2"/>
+              <w:right w:val="single" w:color="CCCCCC" w:sz="2"/>
+            </w:tcBorders>
+            <w:tcMar>
+              <w:top w:type="dxa" w:w="60"/>
+              <w:left w:type="dxa" w:w="100"/>
+              <w:bottom w:type="dxa" w:w="60"/>
+              <w:right w:type="dxa" w:w="100"/>
+            </w:tcMar>
+          </w:tcPr>
+          <w:p>
+            <w:r>
+              <w:rPr>
+                <w:sz w:val="18"/>
+                <w:szCs w:val="18"/>
+              </w:rPr>
+              <w:t xml:space="preserve">Tienda 1 / 2 / 3 / 4</w:t>
+            </w:r>
+          </w:p>
+        </w:tc>
+        <w:tc>
+          <w:tcPr>
+            <w:tcW w:type="dxa" w:w="3200"/>
+            <w:tcBorders>
+              <w:top w:val="single" w:color="CCCCCC" w:sz="2"/>
+              <w:left w:val="single" w:color="CCCCCC" w:sz="2"/>
+              <w:bottom w:val="single" w:color="CCCCCC" w:sz="2"/>
+              <w:right w:val="single" w:color="CCCCCC" w:sz="2"/>
+            </w:tcBorders>
+            <w:tcMar>
+              <w:top w:type="dxa" w:w="60"/>
+              <w:left w:type="dxa" w:w="100"/>
+              <w:bottom w:type="dxa" w:w="60"/>
+              <w:right w:type="dxa" w:w="100"/>
+            </w:tcMar>
+          </w:tcPr>
+          <w:p>
+            <w:r>
+              <w:rPr>
+                <w:sz w:val="18"/>
+                <w:szCs w:val="18"/>
+              </w:rPr>
+              <w:t xml:space="preserve">Nombre de la tienda competidora encontrada en el Scrapp.</w:t>
+            </w:r>
+          </w:p>
+        </w:tc>
+        <w:tc>
+          <w:tcPr>
+            <w:tcW w:type="dxa" w:w="2000"/>
             <w:tcBorders>
               <w:top w:val="single" w:color="CCCCCC" w:sz="2"/>
               <w:left w:val="single" w:color="CCCCCC" w:sz="2"/>
@@ -849,27 +872,27 @@
         </w:tc>
         <w:tc>
           <w:tcPr>
-            <w:tcW w:type="dxa" w:w="2960"/>
-            <w:tcBorders>
-              <w:top w:val="single" w:color="CCCCCC" w:sz="2"/>
-              <w:left w:val="single" w:color="CCCCCC" w:sz="2"/>
-              <w:bottom w:val="single" w:color="CCCCCC" w:sz="2"/>
-              <w:right w:val="single" w:color="CCCCCC" w:sz="2"/>
-            </w:tcBorders>
-            <w:tcMar>
-              <w:top w:type="dxa" w:w="60"/>
-              <w:left w:type="dxa" w:w="100"/>
-              <w:bottom w:type="dxa" w:w="60"/>
-              <w:right w:type="dxa" w:w="100"/>
-            </w:tcMar>
-          </w:tcPr>
-          <w:p>
-            <w:r>
-              <w:rPr>
-                <w:sz w:val="18"/>
-                <w:szCs w:val="18"/>
-              </w:rPr>
-              <w:t xml:space="preserve">(en blanco por ahora)</w:t>
+            <w:tcW w:type="dxa" w:w="2260"/>
+            <w:tcBorders>
+              <w:top w:val="single" w:color="CCCCCC" w:sz="2"/>
+              <w:left w:val="single" w:color="CCCCCC" w:sz="2"/>
+              <w:bottom w:val="single" w:color="CCCCCC" w:sz="2"/>
+              <w:right w:val="single" w:color="CCCCCC" w:sz="2"/>
+            </w:tcBorders>
+            <w:tcMar>
+              <w:top w:type="dxa" w:w="60"/>
+              <w:left w:type="dxa" w:w="100"/>
+              <w:bottom w:type="dxa" w:w="60"/>
+              <w:right w:type="dxa" w:w="100"/>
+            </w:tcMar>
+          </w:tcPr>
+          <w:p>
+            <w:r>
+              <w:rPr>
+                <w:sz w:val="18"/>
+                <w:szCs w:val="18"/>
+              </w:rPr>
+              <w:t xml:space="preserve">Tottus</w:t>
             </w:r>
           </w:p>
         </w:tc>
@@ -877,165 +900,59 @@
       <w:tr>
         <w:tc>
           <w:tcPr>
-            <w:tcW w:type="dxa" w:w="1600"/>
-            <w:tcBorders>
-              <w:top w:val="single" w:color="CCCCCC" w:sz="2"/>
-              <w:left w:val="single" w:color="CCCCCC" w:sz="2"/>
-              <w:bottom w:val="single" w:color="CCCCCC" w:sz="2"/>
-              <w:right w:val="single" w:color="CCCCCC" w:sz="2"/>
-            </w:tcBorders>
-            <w:tcMar>
-              <w:top w:type="dxa" w:w="60"/>
-              <w:left w:type="dxa" w:w="100"/>
-              <w:bottom w:type="dxa" w:w="60"/>
-              <w:right w:type="dxa" w:w="100"/>
-            </w:tcMar>
-          </w:tcPr>
-          <w:p>
-            <w:r>
-              <w:rPr>
-                <w:sz w:val="18"/>
-                <w:szCs w:val="18"/>
-              </w:rPr>
-              <w:t xml:space="preserve">Fecha Comparativa</w:t>
-            </w:r>
-          </w:p>
-        </w:tc>
-        <w:tc>
-          <w:tcPr>
-            <w:tcW w:type="dxa" w:w="2600"/>
-            <w:tcBorders>
-              <w:top w:val="single" w:color="CCCCCC" w:sz="2"/>
-              <w:left w:val="single" w:color="CCCCCC" w:sz="2"/>
-              <w:bottom w:val="single" w:color="CCCCCC" w:sz="2"/>
-              <w:right w:val="single" w:color="CCCCCC" w:sz="2"/>
-            </w:tcBorders>
-            <w:tcMar>
-              <w:top w:type="dxa" w:w="60"/>
-              <w:left w:type="dxa" w:w="100"/>
-              <w:bottom w:type="dxa" w:w="60"/>
-              <w:right w:type="dxa" w:w="100"/>
-            </w:tcMar>
-          </w:tcPr>
-          <w:p>
-            <w:r>
-              <w:rPr>
-                <w:sz w:val="18"/>
-                <w:szCs w:val="18"/>
-              </w:rPr>
-              <w:t xml:space="preserve">Fecha en que se hizo el Scrapp / comparación de precios.</w:t>
-            </w:r>
-          </w:p>
-        </w:tc>
-        <w:tc>
-          <w:tcPr>
-            <w:tcW w:type="dxa" w:w="2200"/>
-            <w:tcBorders>
-              <w:top w:val="single" w:color="CCCCCC" w:sz="2"/>
-              <w:left w:val="single" w:color="CCCCCC" w:sz="2"/>
-              <w:bottom w:val="single" w:color="CCCCCC" w:sz="2"/>
-              <w:right w:val="single" w:color="CCCCCC" w:sz="2"/>
-            </w:tcBorders>
-            <w:tcMar>
-              <w:top w:type="dxa" w:w="60"/>
-              <w:left w:type="dxa" w:w="100"/>
-              <w:bottom w:type="dxa" w:w="60"/>
-              <w:right w:type="dxa" w:w="100"/>
-            </w:tcMar>
-          </w:tcPr>
-          <w:p>
-            <w:r>
-              <w:rPr>
-                <w:sz w:val="18"/>
-                <w:szCs w:val="18"/>
-              </w:rPr>
-              <w:t xml:space="preserve">Sí</w:t>
-            </w:r>
-          </w:p>
-        </w:tc>
-        <w:tc>
-          <w:tcPr>
-            <w:tcW w:type="dxa" w:w="2960"/>
-            <w:tcBorders>
-              <w:top w:val="single" w:color="CCCCCC" w:sz="2"/>
-              <w:left w:val="single" w:color="CCCCCC" w:sz="2"/>
-              <w:bottom w:val="single" w:color="CCCCCC" w:sz="2"/>
-              <w:right w:val="single" w:color="CCCCCC" w:sz="2"/>
-            </w:tcBorders>
-            <w:tcMar>
-              <w:top w:type="dxa" w:w="60"/>
-              <w:left w:type="dxa" w:w="100"/>
-              <w:bottom w:type="dxa" w:w="60"/>
-              <w:right w:type="dxa" w:w="100"/>
-            </w:tcMar>
-          </w:tcPr>
-          <w:p>
-            <w:r>
-              <w:rPr>
-                <w:sz w:val="18"/>
-                <w:szCs w:val="18"/>
-              </w:rPr>
-              <w:t xml:space="preserve">06/07/2026</w:t>
-            </w:r>
-          </w:p>
-        </w:tc>
-      </w:tr>
-      <w:tr>
-        <w:tc>
-          <w:tcPr>
-            <w:tcW w:type="dxa" w:w="1600"/>
-            <w:tcBorders>
-              <w:top w:val="single" w:color="CCCCCC" w:sz="2"/>
-              <w:left w:val="single" w:color="CCCCCC" w:sz="2"/>
-              <w:bottom w:val="single" w:color="CCCCCC" w:sz="2"/>
-              <w:right w:val="single" w:color="CCCCCC" w:sz="2"/>
-            </w:tcBorders>
-            <w:tcMar>
-              <w:top w:type="dxa" w:w="60"/>
-              <w:left w:type="dxa" w:w="100"/>
-              <w:bottom w:type="dxa" w:w="60"/>
-              <w:right w:type="dxa" w:w="100"/>
-            </w:tcMar>
-          </w:tcPr>
-          <w:p>
-            <w:r>
-              <w:rPr>
-                <w:sz w:val="18"/>
-                <w:szCs w:val="18"/>
-              </w:rPr>
-              <w:t xml:space="preserve">Tienda 1 / 2 / 3</w:t>
-            </w:r>
-          </w:p>
-        </w:tc>
-        <w:tc>
-          <w:tcPr>
-            <w:tcW w:type="dxa" w:w="2600"/>
-            <w:tcBorders>
-              <w:top w:val="single" w:color="CCCCCC" w:sz="2"/>
-              <w:left w:val="single" w:color="CCCCCC" w:sz="2"/>
-              <w:bottom w:val="single" w:color="CCCCCC" w:sz="2"/>
-              <w:right w:val="single" w:color="CCCCCC" w:sz="2"/>
-            </w:tcBorders>
-            <w:tcMar>
-              <w:top w:type="dxa" w:w="60"/>
-              <w:left w:type="dxa" w:w="100"/>
-              <w:bottom w:type="dxa" w:w="60"/>
-              <w:right w:type="dxa" w:w="100"/>
-            </w:tcMar>
-          </w:tcPr>
-          <w:p>
-            <w:r>
-              <w:rPr>
-                <w:sz w:val="18"/>
-                <w:szCs w:val="18"/>
-              </w:rPr>
-              <w:t xml:space="preserve">Nombre de la tienda competidora encontrada en el Scrapp.</w:t>
-            </w:r>
-          </w:p>
-        </w:tc>
-        <w:tc>
-          <w:tcPr>
-            <w:tcW w:type="dxa" w:w="2200"/>
+            <w:tcW w:type="dxa" w:w="1900"/>
+            <w:tcBorders>
+              <w:top w:val="single" w:color="CCCCCC" w:sz="2"/>
+              <w:left w:val="single" w:color="CCCCCC" w:sz="2"/>
+              <w:bottom w:val="single" w:color="CCCCCC" w:sz="2"/>
+              <w:right w:val="single" w:color="CCCCCC" w:sz="2"/>
+            </w:tcBorders>
+            <w:tcMar>
+              <w:top w:type="dxa" w:w="60"/>
+              <w:left w:type="dxa" w:w="100"/>
+              <w:bottom w:type="dxa" w:w="60"/>
+              <w:right w:type="dxa" w:w="100"/>
+            </w:tcMar>
+          </w:tcPr>
+          <w:p>
+            <w:r>
+              <w:rPr>
+                <w:sz w:val="18"/>
+                <w:szCs w:val="18"/>
+              </w:rPr>
+              <w:t xml:space="preserve">Precio Competidor 1 / 2 / 3 / 4</w:t>
+            </w:r>
+          </w:p>
+        </w:tc>
+        <w:tc>
+          <w:tcPr>
+            <w:tcW w:type="dxa" w:w="3200"/>
+            <w:tcBorders>
+              <w:top w:val="single" w:color="CCCCCC" w:sz="2"/>
+              <w:left w:val="single" w:color="CCCCCC" w:sz="2"/>
+              <w:bottom w:val="single" w:color="CCCCCC" w:sz="2"/>
+              <w:right w:val="single" w:color="CCCCCC" w:sz="2"/>
+            </w:tcBorders>
+            <w:tcMar>
+              <w:top w:type="dxa" w:w="60"/>
+              <w:left w:type="dxa" w:w="100"/>
+              <w:bottom w:type="dxa" w:w="60"/>
+              <w:right w:type="dxa" w:w="100"/>
+            </w:tcMar>
+          </w:tcPr>
+          <w:p>
+            <w:r>
+              <w:rPr>
+                <w:sz w:val="18"/>
+                <w:szCs w:val="18"/>
+              </w:rPr>
+              <w:t xml:space="preserve">Precio encontrado en esa tienda. Deja ambas celdas en blanco si no hay dato para ese competidor.</w:t>
+            </w:r>
+          </w:p>
+        </w:tc>
+        <w:tc>
+          <w:tcPr>
+            <w:tcW w:type="dxa" w:w="2000"/>
             <w:tcBorders>
               <w:top w:val="single" w:color="CCCCCC" w:sz="2"/>
               <w:left w:val="single" w:color="CCCCCC" w:sz="2"/>
@@ -1061,219 +978,7 @@
         </w:tc>
         <w:tc>
           <w:tcPr>
-            <w:tcW w:type="dxa" w:w="2960"/>
-            <w:tcBorders>
-              <w:top w:val="single" w:color="CCCCCC" w:sz="2"/>
-              <w:left w:val="single" w:color="CCCCCC" w:sz="2"/>
-              <w:bottom w:val="single" w:color="CCCCCC" w:sz="2"/>
-              <w:right w:val="single" w:color="CCCCCC" w:sz="2"/>
-            </w:tcBorders>
-            <w:tcMar>
-              <w:top w:type="dxa" w:w="60"/>
-              <w:left w:type="dxa" w:w="100"/>
-              <w:bottom w:type="dxa" w:w="60"/>
-              <w:right w:type="dxa" w:w="100"/>
-            </w:tcMar>
-          </w:tcPr>
-          <w:p>
-            <w:r>
-              <w:rPr>
-                <w:sz w:val="18"/>
-                <w:szCs w:val="18"/>
-              </w:rPr>
-              <w:t xml:space="preserve">Tottus</w:t>
-            </w:r>
-          </w:p>
-        </w:tc>
-      </w:tr>
-      <w:tr>
-        <w:tc>
-          <w:tcPr>
-            <w:tcW w:type="dxa" w:w="1600"/>
-            <w:tcBorders>
-              <w:top w:val="single" w:color="CCCCCC" w:sz="2"/>
-              <w:left w:val="single" w:color="CCCCCC" w:sz="2"/>
-              <w:bottom w:val="single" w:color="CCCCCC" w:sz="2"/>
-              <w:right w:val="single" w:color="CCCCCC" w:sz="2"/>
-            </w:tcBorders>
-            <w:tcMar>
-              <w:top w:type="dxa" w:w="60"/>
-              <w:left w:type="dxa" w:w="100"/>
-              <w:bottom w:type="dxa" w:w="60"/>
-              <w:right w:type="dxa" w:w="100"/>
-            </w:tcMar>
-          </w:tcPr>
-          <w:p>
-            <w:r>
-              <w:rPr>
-                <w:sz w:val="18"/>
-                <w:szCs w:val="18"/>
-              </w:rPr>
-              <w:t xml:space="preserve">Producto Competidor 1 / 2 / 3</w:t>
-            </w:r>
-          </w:p>
-        </w:tc>
-        <w:tc>
-          <w:tcPr>
-            <w:tcW w:type="dxa" w:w="2600"/>
-            <w:tcBorders>
-              <w:top w:val="single" w:color="CCCCCC" w:sz="2"/>
-              <w:left w:val="single" w:color="CCCCCC" w:sz="2"/>
-              <w:bottom w:val="single" w:color="CCCCCC" w:sz="2"/>
-              <w:right w:val="single" w:color="CCCCCC" w:sz="2"/>
-            </w:tcBorders>
-            <w:tcMar>
-              <w:top w:type="dxa" w:w="60"/>
-              <w:left w:type="dxa" w:w="100"/>
-              <w:bottom w:type="dxa" w:w="60"/>
-              <w:right w:type="dxa" w:w="100"/>
-            </w:tcMar>
-          </w:tcPr>
-          <w:p>
-            <w:r>
-              <w:rPr>
-                <w:sz w:val="18"/>
-                <w:szCs w:val="18"/>
-              </w:rPr>
-              <w:t xml:space="preserve">Nombre/presentación del producto tal como lo vende ese competidor (puede diferir del de Holi).</w:t>
-            </w:r>
-          </w:p>
-        </w:tc>
-        <w:tc>
-          <w:tcPr>
-            <w:tcW w:type="dxa" w:w="2200"/>
-            <w:tcBorders>
-              <w:top w:val="single" w:color="CCCCCC" w:sz="2"/>
-              <w:left w:val="single" w:color="CCCCCC" w:sz="2"/>
-              <w:bottom w:val="single" w:color="CCCCCC" w:sz="2"/>
-              <w:right w:val="single" w:color="CCCCCC" w:sz="2"/>
-            </w:tcBorders>
-            <w:tcMar>
-              <w:top w:type="dxa" w:w="60"/>
-              <w:left w:type="dxa" w:w="100"/>
-              <w:bottom w:type="dxa" w:w="60"/>
-              <w:right w:type="dxa" w:w="100"/>
-            </w:tcMar>
-          </w:tcPr>
-          <w:p>
-            <w:r>
-              <w:rPr>
-                <w:sz w:val="18"/>
-                <w:szCs w:val="18"/>
-              </w:rPr>
-              <w:t xml:space="preserve">No (opcional)</w:t>
-            </w:r>
-          </w:p>
-        </w:tc>
-        <w:tc>
-          <w:tcPr>
-            <w:tcW w:type="dxa" w:w="2960"/>
-            <w:tcBorders>
-              <w:top w:val="single" w:color="CCCCCC" w:sz="2"/>
-              <w:left w:val="single" w:color="CCCCCC" w:sz="2"/>
-              <w:bottom w:val="single" w:color="CCCCCC" w:sz="2"/>
-              <w:right w:val="single" w:color="CCCCCC" w:sz="2"/>
-            </w:tcBorders>
-            <w:tcMar>
-              <w:top w:type="dxa" w:w="60"/>
-              <w:left w:type="dxa" w:w="100"/>
-              <w:bottom w:type="dxa" w:w="60"/>
-              <w:right w:type="dxa" w:w="100"/>
-            </w:tcMar>
-          </w:tcPr>
-          <w:p>
-            <w:r>
-              <w:rPr>
-                <w:sz w:val="18"/>
-                <w:szCs w:val="18"/>
-              </w:rPr>
-              <w:t xml:space="preserve">Tequila Patrón Añejo Botella 750 mL</w:t>
-            </w:r>
-          </w:p>
-        </w:tc>
-      </w:tr>
-      <w:tr>
-        <w:tc>
-          <w:tcPr>
-            <w:tcW w:type="dxa" w:w="1600"/>
-            <w:tcBorders>
-              <w:top w:val="single" w:color="CCCCCC" w:sz="2"/>
-              <w:left w:val="single" w:color="CCCCCC" w:sz="2"/>
-              <w:bottom w:val="single" w:color="CCCCCC" w:sz="2"/>
-              <w:right w:val="single" w:color="CCCCCC" w:sz="2"/>
-            </w:tcBorders>
-            <w:tcMar>
-              <w:top w:type="dxa" w:w="60"/>
-              <w:left w:type="dxa" w:w="100"/>
-              <w:bottom w:type="dxa" w:w="60"/>
-              <w:right w:type="dxa" w:w="100"/>
-            </w:tcMar>
-          </w:tcPr>
-          <w:p>
-            <w:r>
-              <w:rPr>
-                <w:sz w:val="18"/>
-                <w:szCs w:val="18"/>
-              </w:rPr>
-              <w:t xml:space="preserve">Precio Competidor 1 / 2 / 3</w:t>
-            </w:r>
-          </w:p>
-        </w:tc>
-        <w:tc>
-          <w:tcPr>
-            <w:tcW w:type="dxa" w:w="2600"/>
-            <w:tcBorders>
-              <w:top w:val="single" w:color="CCCCCC" w:sz="2"/>
-              <w:left w:val="single" w:color="CCCCCC" w:sz="2"/>
-              <w:bottom w:val="single" w:color="CCCCCC" w:sz="2"/>
-              <w:right w:val="single" w:color="CCCCCC" w:sz="2"/>
-            </w:tcBorders>
-            <w:tcMar>
-              <w:top w:type="dxa" w:w="60"/>
-              <w:left w:type="dxa" w:w="100"/>
-              <w:bottom w:type="dxa" w:w="60"/>
-              <w:right w:type="dxa" w:w="100"/>
-            </w:tcMar>
-          </w:tcPr>
-          <w:p>
-            <w:r>
-              <w:rPr>
-                <w:sz w:val="18"/>
-                <w:szCs w:val="18"/>
-              </w:rPr>
-              <w:t xml:space="preserve">Precio encontrado en ese competidor. Obligatorio solo si llenaste la Tienda correspondiente.</w:t>
-            </w:r>
-          </w:p>
-        </w:tc>
-        <w:tc>
-          <w:tcPr>
-            <w:tcW w:type="dxa" w:w="2200"/>
-            <w:tcBorders>
-              <w:top w:val="single" w:color="CCCCCC" w:sz="2"/>
-              <w:left w:val="single" w:color="CCCCCC" w:sz="2"/>
-              <w:bottom w:val="single" w:color="CCCCCC" w:sz="2"/>
-              <w:right w:val="single" w:color="CCCCCC" w:sz="2"/>
-            </w:tcBorders>
-            <w:tcMar>
-              <w:top w:type="dxa" w:w="60"/>
-              <w:left w:type="dxa" w:w="100"/>
-              <w:bottom w:type="dxa" w:w="60"/>
-              <w:right w:type="dxa" w:w="100"/>
-            </w:tcMar>
-          </w:tcPr>
-          <w:p>
-            <w:r>
-              <w:rPr>
-                <w:sz w:val="18"/>
-                <w:szCs w:val="18"/>
-              </w:rPr>
-              <w:t xml:space="preserve">No (opcional)</w:t>
-            </w:r>
-          </w:p>
-        </w:tc>
-        <w:tc>
-          <w:tcPr>
-            <w:tcW w:type="dxa" w:w="2960"/>
+            <w:tcW w:type="dxa" w:w="2260"/>
             <w:tcBorders>
               <w:top w:val="single" w:color="CCCCCC" w:sz="2"/>
               <w:left w:val="single" w:color="CCCCCC" w:sz="2"/>
@@ -1294,218 +999,6 @@
                 <w:szCs w:val="18"/>
               </w:rPr>
               <w:t xml:space="preserve">299.90</w:t>
-            </w:r>
-          </w:p>
-        </w:tc>
-      </w:tr>
-      <w:tr>
-        <w:tc>
-          <w:tcPr>
-            <w:tcW w:type="dxa" w:w="1600"/>
-            <w:tcBorders>
-              <w:top w:val="single" w:color="CCCCCC" w:sz="2"/>
-              <w:left w:val="single" w:color="CCCCCC" w:sz="2"/>
-              <w:bottom w:val="single" w:color="CCCCCC" w:sz="2"/>
-              <w:right w:val="single" w:color="CCCCCC" w:sz="2"/>
-            </w:tcBorders>
-            <w:tcMar>
-              <w:top w:type="dxa" w:w="60"/>
-              <w:left w:type="dxa" w:w="100"/>
-              <w:bottom w:type="dxa" w:w="60"/>
-              <w:right w:type="dxa" w:w="100"/>
-            </w:tcMar>
-          </w:tcPr>
-          <w:p>
-            <w:r>
-              <w:rPr>
-                <w:sz w:val="18"/>
-                <w:szCs w:val="18"/>
-              </w:rPr>
-              <w:t xml:space="preserve">Imagen Competidor 1 / 2 / 3</w:t>
-            </w:r>
-          </w:p>
-        </w:tc>
-        <w:tc>
-          <w:tcPr>
-            <w:tcW w:type="dxa" w:w="2600"/>
-            <w:tcBorders>
-              <w:top w:val="single" w:color="CCCCCC" w:sz="2"/>
-              <w:left w:val="single" w:color="CCCCCC" w:sz="2"/>
-              <w:bottom w:val="single" w:color="CCCCCC" w:sz="2"/>
-              <w:right w:val="single" w:color="CCCCCC" w:sz="2"/>
-            </w:tcBorders>
-            <w:tcMar>
-              <w:top w:type="dxa" w:w="60"/>
-              <w:left w:type="dxa" w:w="100"/>
-              <w:bottom w:type="dxa" w:w="60"/>
-              <w:right w:type="dxa" w:w="100"/>
-            </w:tcMar>
-          </w:tcPr>
-          <w:p>
-            <w:r>
-              <w:rPr>
-                <w:sz w:val="18"/>
-                <w:szCs w:val="18"/>
-              </w:rPr>
-              <w:t xml:space="preserve">URL de la foto del producto del competidor. En blanco, muestra un ícono genérico.</w:t>
-            </w:r>
-          </w:p>
-        </w:tc>
-        <w:tc>
-          <w:tcPr>
-            <w:tcW w:type="dxa" w:w="2200"/>
-            <w:tcBorders>
-              <w:top w:val="single" w:color="CCCCCC" w:sz="2"/>
-              <w:left w:val="single" w:color="CCCCCC" w:sz="2"/>
-              <w:bottom w:val="single" w:color="CCCCCC" w:sz="2"/>
-              <w:right w:val="single" w:color="CCCCCC" w:sz="2"/>
-            </w:tcBorders>
-            <w:tcMar>
-              <w:top w:type="dxa" w:w="60"/>
-              <w:left w:type="dxa" w:w="100"/>
-              <w:bottom w:type="dxa" w:w="60"/>
-              <w:right w:type="dxa" w:w="100"/>
-            </w:tcMar>
-          </w:tcPr>
-          <w:p>
-            <w:r>
-              <w:rPr>
-                <w:sz w:val="18"/>
-                <w:szCs w:val="18"/>
-              </w:rPr>
-              <w:t xml:space="preserve">No (opcional)</w:t>
-            </w:r>
-          </w:p>
-        </w:tc>
-        <w:tc>
-          <w:tcPr>
-            <w:tcW w:type="dxa" w:w="2960"/>
-            <w:tcBorders>
-              <w:top w:val="single" w:color="CCCCCC" w:sz="2"/>
-              <w:left w:val="single" w:color="CCCCCC" w:sz="2"/>
-              <w:bottom w:val="single" w:color="CCCCCC" w:sz="2"/>
-              <w:right w:val="single" w:color="CCCCCC" w:sz="2"/>
-            </w:tcBorders>
-            <w:tcMar>
-              <w:top w:type="dxa" w:w="60"/>
-              <w:left w:type="dxa" w:w="100"/>
-              <w:bottom w:type="dxa" w:w="60"/>
-              <w:right w:type="dxa" w:w="100"/>
-            </w:tcMar>
-          </w:tcPr>
-          <w:p>
-            <w:r>
-              <w:rPr>
-                <w:sz w:val="18"/>
-                <w:szCs w:val="18"/>
-              </w:rPr>
-              <w:t xml:space="preserve">(en blanco por ahora)</w:t>
-            </w:r>
-          </w:p>
-        </w:tc>
-      </w:tr>
-      <w:tr>
-        <w:tc>
-          <w:tcPr>
-            <w:tcW w:type="dxa" w:w="1600"/>
-            <w:tcBorders>
-              <w:top w:val="single" w:color="CCCCCC" w:sz="2"/>
-              <w:left w:val="single" w:color="CCCCCC" w:sz="2"/>
-              <w:bottom w:val="single" w:color="CCCCCC" w:sz="2"/>
-              <w:right w:val="single" w:color="CCCCCC" w:sz="2"/>
-            </w:tcBorders>
-            <w:tcMar>
-              <w:top w:type="dxa" w:w="60"/>
-              <w:left w:type="dxa" w:w="100"/>
-              <w:bottom w:type="dxa" w:w="60"/>
-              <w:right w:type="dxa" w:w="100"/>
-            </w:tcMar>
-          </w:tcPr>
-          <w:p>
-            <w:r>
-              <w:rPr>
-                <w:sz w:val="18"/>
-                <w:szCs w:val="18"/>
-              </w:rPr>
-              <w:t xml:space="preserve">Fecha Competidor 1 / 2 / 3</w:t>
-            </w:r>
-          </w:p>
-        </w:tc>
-        <w:tc>
-          <w:tcPr>
-            <w:tcW w:type="dxa" w:w="2600"/>
-            <w:tcBorders>
-              <w:top w:val="single" w:color="CCCCCC" w:sz="2"/>
-              <w:left w:val="single" w:color="CCCCCC" w:sz="2"/>
-              <w:bottom w:val="single" w:color="CCCCCC" w:sz="2"/>
-              <w:right w:val="single" w:color="CCCCCC" w:sz="2"/>
-            </w:tcBorders>
-            <w:tcMar>
-              <w:top w:type="dxa" w:w="60"/>
-              <w:left w:type="dxa" w:w="100"/>
-              <w:bottom w:type="dxa" w:w="60"/>
-              <w:right w:type="dxa" w:w="100"/>
-            </w:tcMar>
-          </w:tcPr>
-          <w:p>
-            <w:r>
-              <w:rPr>
-                <w:sz w:val="18"/>
-                <w:szCs w:val="18"/>
-              </w:rPr>
-              <w:t xml:space="preserve">Fecha específica de ese competidor, si es distinta a la Fecha Comparativa general. En blanco, se usa la fecha general.</w:t>
-            </w:r>
-          </w:p>
-        </w:tc>
-        <w:tc>
-          <w:tcPr>
-            <w:tcW w:type="dxa" w:w="2200"/>
-            <w:tcBorders>
-              <w:top w:val="single" w:color="CCCCCC" w:sz="2"/>
-              <w:left w:val="single" w:color="CCCCCC" w:sz="2"/>
-              <w:bottom w:val="single" w:color="CCCCCC" w:sz="2"/>
-              <w:right w:val="single" w:color="CCCCCC" w:sz="2"/>
-            </w:tcBorders>
-            <w:tcMar>
-              <w:top w:type="dxa" w:w="60"/>
-              <w:left w:type="dxa" w:w="100"/>
-              <w:bottom w:type="dxa" w:w="60"/>
-              <w:right w:type="dxa" w:w="100"/>
-            </w:tcMar>
-          </w:tcPr>
-          <w:p>
-            <w:r>
-              <w:rPr>
-                <w:sz w:val="18"/>
-                <w:szCs w:val="18"/>
-              </w:rPr>
-              <w:t xml:space="preserve">No (opcional)</w:t>
-            </w:r>
-          </w:p>
-        </w:tc>
-        <w:tc>
-          <w:tcPr>
-            <w:tcW w:type="dxa" w:w="2960"/>
-            <w:tcBorders>
-              <w:top w:val="single" w:color="CCCCCC" w:sz="2"/>
-              <w:left w:val="single" w:color="CCCCCC" w:sz="2"/>
-              <w:bottom w:val="single" w:color="CCCCCC" w:sz="2"/>
-              <w:right w:val="single" w:color="CCCCCC" w:sz="2"/>
-            </w:tcBorders>
-            <w:tcMar>
-              <w:top w:type="dxa" w:w="60"/>
-              <w:left w:type="dxa" w:w="100"/>
-              <w:bottom w:type="dxa" w:w="60"/>
-              <w:right w:type="dxa" w:w="100"/>
-            </w:tcMar>
-          </w:tcPr>
-          <w:p>
-            <w:r>
-              <w:rPr>
-                <w:sz w:val="18"/>
-                <w:szCs w:val="18"/>
-              </w:rPr>
-              <w:t xml:space="preserve">(en blanco = usa la general)</w:t>
             </w:r>
           </w:p>
         </w:tc>
@@ -1550,7 +1043,7 @@
         <w:spacing w:after="80"/>
       </w:pPr>
       <w:r>
-        <w:t xml:space="preserve">Si se agrega un producto NUEVO al programa Best Price, avisar a TI para que genere el nuevo QR (script generar_qr.py) antes de imprimir la viñeta.</w:t>
+        <w:t xml:space="preserve">No hace falta escribir el nombre del producto de cada competidor ni su fecha: el sistema siempre usa el nombre del producto Holi y la fecha en que subiste el Excel.</w:t>
       </w:r>
     </w:p>
     <w:p>
@@ -1563,7 +1056,7 @@
         <w:spacing w:after="80"/>
       </w:pPr>
       <w:r>
-        <w:t xml:space="preserve">No editar comparativa.html directamente: ese archivo no cambia, solo se actualiza el Excel/JSON de datos.</w:t>
+        <w:t xml:space="preserve">La foto de un producto se sube UNA sola vez; si vuelves a subir el Excel la semana siguiente, la foto ya cargada se conserva automáticamente (no hay que subirla de nuevo).</w:t>
       </w:r>
     </w:p>
     <w:p>
@@ -1576,7 +1069,7 @@
         <w:spacing w:after="80"/>
       </w:pPr>
       <w:r>
-        <w:t xml:space="preserve">El disclaimer legal del programa ya está incluido de forma fija en la página; Pricing no necesita editarlo.</w:t>
+        <w:t xml:space="preserve">Si se agrega un producto NUEVO al programa Best Price, avisar a TI para que genere el nuevo QR antes de imprimir la viñeta (eso sí requiere a TI, una sola vez por producto).</w:t>
       </w:r>
     </w:p>
     <w:p>
@@ -1589,6 +1082,19 @@
         <w:spacing w:after="80"/>
       </w:pPr>
       <w:r>
+        <w:t xml:space="preserve">El disclaimer legal del programa ya está incluido de forma fija en la página; Pricing no necesita editarlo.</w:t>
+      </w:r>
+    </w:p>
+    <w:p>
+      <w:pPr>
+        <w:pStyle w:val="ListParagraph"/>
+        <w:numPr>
+          <w:ilvl w:val="0"/>
+          <w:numId w:val="3"/>
+        </w:numPr>
+        <w:spacing w:after="80"/>
+      </w:pPr>
+      <w:r>
         <w:t xml:space="preserve">El sistema calcula automáticamente el monto y el porcentaje de diferencia (“por encima” o “por debajo”) entre el precio Holi y cada competidor; Pricing solo ingresa los precios, no el cálculo.</w:t>
       </w:r>
     </w:p>
@@ -1605,7 +1111,7 @@
         <w:spacing w:after="120"/>
       </w:pPr>
       <w:r>
-        <w:t xml:space="preserve">Contactar al equipo de TI indicando el SKU afectado y, de ser posible, una captura de pantalla del error.</w:t>
+        <w:t xml:space="preserve">Contactar al equipo de TI indicando el SKU afectado y, de ser posible, una captura de pantalla del mensaje de error que aparece en el panel.</w:t>
       </w:r>
     </w:p>
     <w:sectPr>
@@ -1673,7 +1179,7 @@
         <w:sz w:val="16"/>
         <w:szCs w:val="16"/>
       </w:rPr>
-      <w:t xml:space="preserve">Documento vivo — se actualizará conforme se defina el hosting final y futuras automatizaciones. · Página </w:t>
+      <w:t xml:space="preserve">Documento vivo — se actualizará si cambia el panel o la URL. · Página </w:t>
     </w:r>
     <w:r>
       <w:rPr>
@@ -1739,7 +1245,7 @@
       <w:rPr>
         <w:b/>
         <w:bCs/>
-        <w:color w:val="2E7D32"/>
+        <w:color w:val="C2185B"/>
         <w:sz w:val="18"/>
         <w:szCs w:val="18"/>
       </w:rPr>
@@ -2084,7 +1590,7 @@
       <w:rFonts w:ascii="Arial" w:cs="Arial" w:eastAsia="Arial" w:hAnsi="Arial"/>
       <w:b/>
       <w:bCs/>
-      <w:color w:val="2E7D32"/>
+      <w:color w:val="C2185B"/>
       <w:sz w:val="30"/>
       <w:szCs w:val="30"/>
     </w:rPr>

</xml_diff>